<commit_message>
docs: add new-user price fallback and navigation cleanup to task book
Co-authored-by: Ashleymmy <Ashleymmy@users.noreply.github.com>
</commit_message>
<xml_diff>
--- a/改造/Codex实施任务书_报表归因与拉新拉活_2026-10-08.docx
+++ b/改造/Codex实施任务书_报表归因与拉新拉活_2026-10-08.docx
@@ -353,10 +353,10 @@
         <w:rPr>
           <w:b/>
         </w:rPr>
-        <w:t>P0 的每个任务单独提交、单独可上线</w:t>
-      </w:r>
-      <w:r>
-        <w:t>，按编号顺序做。</w:t>
+        <w:t>P0 共 10 项，每项单独提交、单独可上线</w:t>
+      </w:r>
+      <w:r>
+        <w:t>，按编号顺序做。P0-10（导航清理）不依赖其他任务，可以和 P0-1 同时开始。</w:t>
       </w:r>
     </w:p>
     <w:p>
@@ -817,7 +817,20 @@
               <w:rPr>
                 <w:sz w:val="18"/>
               </w:rPr>
-              <w:t>拉新的现有计价方式（按推广任务 × 收款人报价）在 P0 不改；P2 再迁移到角色单价</w:t>
+              <w:t>拉新的现有计价方式（按推广任务 × 收款人报价）在 P0 保留，</w:t>
+            </w:r>
+            <w:r>
+              <w:rPr>
+                <w:b/>
+                <w:sz w:val="18"/>
+              </w:rPr>
+              <w:t>缺价时按角色单价兜底</w:t>
+            </w:r>
+            <w:r>
+              <w:rPr>
+                <w:sz w:val="18"/>
+              </w:rPr>
+              <w:t>（10 / 8.5 / 8 / 0.5，见 P0-9）；P2 再完整迁移到角色单价</w:t>
             </w:r>
           </w:p>
         </w:tc>
@@ -5453,16 +5466,7 @@
         <w:pStyle w:val="ListBullet"/>
       </w:pPr>
       <w:r>
-        <w:t>拉新的规则本期</w:t>
-      </w:r>
-      <w:r>
-        <w:rPr>
-          <w:b/>
-        </w:rPr>
-        <w:t>不写入</w:t>
-      </w:r>
-      <w:r>
-        <w:t>（规则 R9）。</w:t>
+        <w:t>拉新的 4 条角色单价也写在这里，只作为缺价时的兜底，见 P0-9。</w:t>
       </w:r>
     </w:p>
     <w:p>
@@ -6788,15 +6792,181 @@
     </w:p>
     <w:p>
       <w:pPr>
-        <w:pStyle w:val="Heading1"/>
+        <w:pStyle w:val="Heading2"/>
       </w:pPr>
       <w:r>
-        <w:t>4. P1 体验重做（P0 完成后）</w:t>
+        <w:t>P0-9 拉新缺价兜底</w:t>
       </w:r>
     </w:p>
     <w:p>
       <w:r>
-        <w:t>按归因方案第 4、5 节和原型实现，要点如下：</w:t>
+        <w:rPr>
+          <w:b/>
+        </w:rPr>
+        <w:t>问题</w:t>
+      </w:r>
+      <w:r>
+        <w:t xml:space="preserve">：拉新按“推广任务 × 具体收款人”逐个报价，新成员、新任务没设价就算不出钱；上级是管理员的达人永远缺价，因为 </w:t>
+      </w:r>
+      <w:r>
+        <w:rPr>
+          <w:rFonts w:ascii="Consolas" w:hAnsi="Consolas"/>
+          <w:sz w:val="19"/>
+        </w:rPr>
+        <w:t>pricing.ts</w:t>
+      </w:r>
+      <w:r>
+        <w:t xml:space="preserve"> 第 38、106 行要求“上级为空”，与 </w:t>
+      </w:r>
+      <w:r>
+        <w:rPr>
+          <w:rFonts w:ascii="Consolas" w:hAnsi="Consolas"/>
+          <w:sz w:val="19"/>
+        </w:rPr>
+        <w:t>relationships.ts</w:t>
+      </w:r>
+      <w:r>
+        <w:t xml:space="preserve"> 的“直属达人”判断矛盾。</w:t>
+      </w:r>
+    </w:p>
+    <w:p>
+      <w:r>
+        <w:rPr>
+          <w:b/>
+        </w:rPr>
+        <w:t>做法</w:t>
+      </w:r>
+      <w:r>
+        <w:t>：现有报价优先，缺价时用角色单价兜底，不改动已有报价和已确认的账。</w:t>
+      </w:r>
+    </w:p>
+    <w:p>
+      <w:pPr>
+        <w:pStyle w:val="ListNumber"/>
+      </w:pPr>
+      <w:r>
+        <w:rPr>
+          <w:rFonts w:ascii="Consolas" w:hAnsi="Consolas"/>
+          <w:sz w:val="19"/>
+        </w:rPr>
+        <w:t>029_metric_types.sql</w:t>
+      </w:r>
+      <w:r>
+        <w:t xml:space="preserve"> 末尾同时写入拉新的 4 条角色单价（</w:t>
+      </w:r>
+      <w:r>
+        <w:rPr>
+          <w:rFonts w:ascii="Consolas" w:hAnsi="Consolas"/>
+          <w:sz w:val="19"/>
+        </w:rPr>
+        <w:t>metric_type='new_user'</w:t>
+      </w:r>
+      <w:r>
+        <w:t xml:space="preserve">，生效日 </w:t>
+      </w:r>
+      <w:r>
+        <w:rPr>
+          <w:rFonts w:ascii="Consolas" w:hAnsi="Consolas"/>
+          <w:sz w:val="19"/>
+        </w:rPr>
+        <w:t>2026-01-01</w:t>
+      </w:r>
+      <w:r>
+        <w:t>）：</w:t>
+      </w:r>
+      <w:r>
+        <w:rPr>
+          <w:rFonts w:ascii="Consolas" w:hAnsi="Consolas"/>
+          <w:sz w:val="19"/>
+        </w:rPr>
+        <w:t>staff_self</w:t>
+      </w:r>
+      <w:r>
+        <w:t xml:space="preserve"> 10.00、</w:t>
+      </w:r>
+      <w:r>
+        <w:rPr>
+          <w:rFonts w:ascii="Consolas" w:hAnsi="Consolas"/>
+          <w:sz w:val="19"/>
+        </w:rPr>
+        <w:t>leader_self</w:t>
+      </w:r>
+      <w:r>
+        <w:t xml:space="preserve"> 8.50、</w:t>
+      </w:r>
+      <w:r>
+        <w:rPr>
+          <w:rFonts w:ascii="Consolas" w:hAnsi="Consolas"/>
+          <w:sz w:val="19"/>
+        </w:rPr>
+        <w:t>creator</w:t>
+      </w:r>
+      <w:r>
+        <w:t xml:space="preserve"> 8.00、</w:t>
+      </w:r>
+      <w:r>
+        <w:rPr>
+          <w:rFonts w:ascii="Consolas" w:hAnsi="Consolas"/>
+          <w:sz w:val="19"/>
+        </w:rPr>
+        <w:t>leader_override</w:t>
+      </w:r>
+      <w:r>
+        <w:t xml:space="preserve"> 0.50。</w:t>
+      </w:r>
+    </w:p>
+    <w:p>
+      <w:pPr>
+        <w:pStyle w:val="ListNumber"/>
+      </w:pPr>
+      <w:r>
+        <w:rPr>
+          <w:rFonts w:ascii="Consolas" w:hAnsi="Consolas"/>
+          <w:sz w:val="19"/>
+        </w:rPr>
+        <w:t>pricing.ts</w:t>
+      </w:r>
+      <w:r>
+        <w:t xml:space="preserve"> 的 </w:t>
+      </w:r>
+      <w:r>
+        <w:rPr>
+          <w:rFonts w:ascii="Consolas" w:hAnsi="Consolas"/>
+          <w:sz w:val="19"/>
+        </w:rPr>
+        <w:t>quote()</w:t>
+      </w:r>
+      <w:r>
+        <w:t>：每条付款路径先按现有方式查报价；</w:t>
+      </w:r>
+      <w:r>
+        <w:rPr>
+          <w:b/>
+        </w:rPr>
+        <w:t>查不到时</w:t>
+      </w:r>
+      <w:r>
+        <w:t xml:space="preserve">，按下表从 </w:t>
+      </w:r>
+      <w:r>
+        <w:rPr>
+          <w:rFonts w:ascii="Consolas" w:hAnsi="Consolas"/>
+          <w:sz w:val="19"/>
+        </w:rPr>
+        <w:t>opc_rate_rules</w:t>
+      </w:r>
+      <w:r>
+        <w:t xml:space="preserve"> 取兜底价。关系类型名称保持原样（</w:t>
+      </w:r>
+      <w:r>
+        <w:rPr>
+          <w:rFonts w:ascii="Consolas" w:hAnsi="Consolas"/>
+          <w:sz w:val="19"/>
+        </w:rPr>
+        <w:t>agency_leader / leader_creator / agency_creator</w:t>
+      </w:r>
+      <w:r>
+        <w:t>），因此现有确认和更正链不受影响：</w:t>
       </w:r>
     </w:p>
     <w:tbl>
@@ -6828,7 +6998,7 @@
                 <w:b/>
                 <w:sz w:val="18"/>
               </w:rPr>
-              <w:t>编号</w:t>
+              <w:t>绑定类型</w:t>
             </w:r>
           </w:p>
         </w:tc>
@@ -6848,7 +7018,7 @@
                 <w:b/>
                 <w:sz w:val="18"/>
               </w:rPr>
-              <w:t>内容</w:t>
+              <w:t>付款路径</w:t>
             </w:r>
           </w:p>
         </w:tc>
@@ -6868,7 +7038,7 @@
                 <w:b/>
                 <w:sz w:val="18"/>
               </w:rPr>
-              <w:t>依据</w:t>
+              <w:t>兜底单价</w:t>
             </w:r>
           </w:p>
         </w:tc>
@@ -6886,9 +7056,10 @@
             </w:r>
             <w:r>
               <w:rPr>
-                <w:sz w:val="18"/>
-              </w:rPr>
-              <w:t>P1-1</w:t>
+                <w:rFonts w:ascii="Consolas" w:hAnsi="Consolas"/>
+                <w:sz w:val="18"/>
+              </w:rPr>
+              <w:t>leader_self</w:t>
             </w:r>
           </w:p>
         </w:tc>
@@ -6904,35 +7075,10 @@
             </w:r>
             <w:r>
               <w:rPr>
-                <w:sz w:val="18"/>
-              </w:rPr>
-              <w:t xml:space="preserve">平台共享组件：分析过程面板 </w:t>
-            </w:r>
-            <w:r>
-              <w:rPr>
                 <w:rFonts w:ascii="Consolas" w:hAnsi="Consolas"/>
                 <w:sz w:val="18"/>
               </w:rPr>
-              <w:t>AnalysisRun.vue</w:t>
-            </w:r>
-            <w:r>
-              <w:rPr>
-                <w:sz w:val="18"/>
-              </w:rPr>
-              <w:t xml:space="preserve">、多维表格 </w:t>
-            </w:r>
-            <w:r>
-              <w:rPr>
-                <w:rFonts w:ascii="Consolas" w:hAnsi="Consolas"/>
-                <w:sz w:val="18"/>
-              </w:rPr>
-              <w:t>DataGrid.vue</w:t>
-            </w:r>
-            <w:r>
-              <w:rPr>
-                <w:sz w:val="18"/>
-              </w:rPr>
-              <w:t>（视图、分组、状态标签、下一步列、底部合计、行抽屉、窄屏卡片）</w:t>
+              <w:t>agency_leader</w:t>
             </w:r>
           </w:p>
         </w:tc>
@@ -6948,9 +7094,16 @@
             </w:r>
             <w:r>
               <w:rPr>
-                <w:sz w:val="18"/>
-              </w:rPr>
-              <w:t>规范 5.1、5.2；原型</w:t>
+                <w:rFonts w:ascii="Consolas" w:hAnsi="Consolas"/>
+                <w:sz w:val="18"/>
+              </w:rPr>
+              <w:t>leader_self</w:t>
+            </w:r>
+            <w:r>
+              <w:rPr>
+                <w:sz w:val="18"/>
+              </w:rPr>
+              <w:t>（8.50）</w:t>
             </w:r>
           </w:p>
         </w:tc>
@@ -6968,9 +7121,10 @@
             </w:r>
             <w:r>
               <w:rPr>
-                <w:sz w:val="18"/>
-              </w:rPr>
-              <w:t>P1-2</w:t>
+                <w:rFonts w:ascii="Consolas" w:hAnsi="Consolas"/>
+                <w:sz w:val="18"/>
+              </w:rPr>
+              <w:t>team_creator</w:t>
             </w:r>
           </w:p>
         </w:tc>
@@ -6986,29 +7140,10 @@
             </w:r>
             <w:r>
               <w:rPr>
-                <w:sz w:val="18"/>
-              </w:rPr>
-              <w:t xml:space="preserve">分析记录接口 </w:t>
-            </w:r>
-            <w:r>
-              <w:rPr>
                 <w:rFonts w:ascii="Consolas" w:hAnsi="Consolas"/>
                 <w:sz w:val="18"/>
               </w:rPr>
-              <w:t>GET /imports/:id/analysis</w:t>
-            </w:r>
-            <w:r>
-              <w:rPr>
-                <w:sz w:val="18"/>
-              </w:rPr>
-              <w:t>、</w:t>
-            </w:r>
-            <w:r>
-              <w:rPr>
-                <w:rFonts w:ascii="Consolas" w:hAnsi="Consolas"/>
-                <w:sz w:val="18"/>
-              </w:rPr>
-              <w:t>POST /imports/:id/answers</w:t>
+              <w:t>agency_leader</w:t>
             </w:r>
           </w:p>
         </w:tc>
@@ -7024,9 +7159,16 @@
             </w:r>
             <w:r>
               <w:rPr>
-                <w:sz w:val="18"/>
-              </w:rPr>
-              <w:t>归因方案 5.1</w:t>
+                <w:rFonts w:ascii="Consolas" w:hAnsi="Consolas"/>
+                <w:sz w:val="18"/>
+              </w:rPr>
+              <w:t>leader_self</w:t>
+            </w:r>
+            <w:r>
+              <w:rPr>
+                <w:sz w:val="18"/>
+              </w:rPr>
+              <w:t>（8.50）</w:t>
             </w:r>
           </w:p>
         </w:tc>
@@ -7044,9 +7186,10 @@
             </w:r>
             <w:r>
               <w:rPr>
-                <w:sz w:val="18"/>
-              </w:rPr>
-              <w:t>P1-3</w:t>
+                <w:rFonts w:ascii="Consolas" w:hAnsi="Consolas"/>
+                <w:sz w:val="18"/>
+              </w:rPr>
+              <w:t>team_creator</w:t>
             </w:r>
           </w:p>
         </w:tc>
@@ -7062,9 +7205,10 @@
             </w:r>
             <w:r>
               <w:rPr>
-                <w:sz w:val="18"/>
-              </w:rPr>
-              <w:t>渠道和关键词名称归一化与相近候选，就地确认</w:t>
+                <w:rFonts w:ascii="Consolas" w:hAnsi="Consolas"/>
+                <w:sz w:val="18"/>
+              </w:rPr>
+              <w:t>leader_creator</w:t>
             </w:r>
           </w:p>
         </w:tc>
@@ -7080,9 +7224,16 @@
             </w:r>
             <w:r>
               <w:rPr>
-                <w:sz w:val="18"/>
-              </w:rPr>
-              <w:t>归因方案 E5、E6、4.4</w:t>
+                <w:rFonts w:ascii="Consolas" w:hAnsi="Consolas"/>
+                <w:sz w:val="18"/>
+              </w:rPr>
+              <w:t>creator</w:t>
+            </w:r>
+            <w:r>
+              <w:rPr>
+                <w:sz w:val="18"/>
+              </w:rPr>
+              <w:t>（8.00），团长净得 0.50</w:t>
             </w:r>
           </w:p>
         </w:tc>
@@ -7100,9 +7251,10 @@
             </w:r>
             <w:r>
               <w:rPr>
-                <w:sz w:val="18"/>
-              </w:rPr>
-              <w:t>P1-4</w:t>
+                <w:rFonts w:ascii="Consolas" w:hAnsi="Consolas"/>
+                <w:sz w:val="18"/>
+              </w:rPr>
+              <w:t>direct_creator</w:t>
             </w:r>
           </w:p>
         </w:tc>
@@ -7118,9 +7270,10 @@
             </w:r>
             <w:r>
               <w:rPr>
-                <w:sz w:val="18"/>
-              </w:rPr>
-              <w:t>登记历史关键词（不推送知乎）</w:t>
+                <w:rFonts w:ascii="Consolas" w:hAnsi="Consolas"/>
+                <w:sz w:val="18"/>
+              </w:rPr>
+              <w:t>agency_creator</w:t>
             </w:r>
           </w:p>
         </w:tc>
@@ -7136,358 +7289,16 @@
             </w:r>
             <w:r>
               <w:rPr>
-                <w:sz w:val="18"/>
-              </w:rPr>
-              <w:t>平台方案 F7</w:t>
-            </w:r>
-          </w:p>
-        </w:tc>
-      </w:tr>
-      <w:tr>
-        <w:tc>
-          <w:tcPr>
-            <w:tcW w:type="dxa" w:w="3324"/>
-          </w:tcPr>
-          <w:p>
-            <w:r>
-              <w:rPr>
-                <w:sz w:val="18"/>
-              </w:rPr>
-            </w:r>
-            <w:r>
-              <w:rPr>
-                <w:sz w:val="18"/>
-              </w:rPr>
-              <w:t>P1-5</w:t>
-            </w:r>
-          </w:p>
-        </w:tc>
-        <w:tc>
-          <w:tcPr>
-            <w:tcW w:type="dxa" w:w="3324"/>
-          </w:tcPr>
-          <w:p>
-            <w:r>
-              <w:rPr>
-                <w:sz w:val="18"/>
-              </w:rPr>
-            </w:r>
-            <w:r>
-              <w:rPr>
-                <w:sz w:val="18"/>
-              </w:rPr>
-              <w:t>修复动作完成后自动重算（渠道确认、作品核验、单价发布、补录归属）</w:t>
-            </w:r>
-          </w:p>
-        </w:tc>
-        <w:tc>
-          <w:tcPr>
-            <w:tcW w:type="dxa" w:w="3324"/>
-          </w:tcPr>
-          <w:p>
-            <w:r>
-              <w:rPr>
-                <w:sz w:val="18"/>
-              </w:rPr>
-            </w:r>
-            <w:r>
-              <w:rPr>
-                <w:sz w:val="18"/>
-              </w:rPr>
-              <w:t>平台方案 6.2</w:t>
-            </w:r>
-          </w:p>
-        </w:tc>
-      </w:tr>
-      <w:tr>
-        <w:tc>
-          <w:tcPr>
-            <w:tcW w:type="dxa" w:w="3324"/>
-          </w:tcPr>
-          <w:p>
-            <w:r>
-              <w:rPr>
-                <w:sz w:val="18"/>
-              </w:rPr>
-            </w:r>
-            <w:r>
-              <w:rPr>
-                <w:sz w:val="18"/>
-              </w:rPr>
-              <w:t>P1-6</w:t>
-            </w:r>
-          </w:p>
-        </w:tc>
-        <w:tc>
-          <w:tcPr>
-            <w:tcW w:type="dxa" w:w="3324"/>
-          </w:tcPr>
-          <w:p>
-            <w:r>
-              <w:rPr>
-                <w:sz w:val="18"/>
-              </w:rPr>
-            </w:r>
-            <w:r>
-              <w:rPr>
-                <w:sz w:val="18"/>
-              </w:rPr>
-              <w:t>风险判定：照常计价、阻止确认、人工核实</w:t>
-            </w:r>
-          </w:p>
-        </w:tc>
-        <w:tc>
-          <w:tcPr>
-            <w:tcW w:type="dxa" w:w="3324"/>
-          </w:tcPr>
-          <w:p>
-            <w:r>
-              <w:rPr>
-                <w:sz w:val="18"/>
-              </w:rPr>
-            </w:r>
-            <w:r>
-              <w:rPr>
-                <w:sz w:val="18"/>
-              </w:rPr>
-              <w:t>归因方案 E7</w:t>
-            </w:r>
-          </w:p>
-        </w:tc>
-      </w:tr>
-      <w:tr>
-        <w:tc>
-          <w:tcPr>
-            <w:tcW w:type="dxa" w:w="3324"/>
-          </w:tcPr>
-          <w:p>
-            <w:r>
-              <w:rPr>
-                <w:sz w:val="18"/>
-              </w:rPr>
-            </w:r>
-            <w:r>
-              <w:rPr>
-                <w:sz w:val="18"/>
-              </w:rPr>
-              <w:t>P1-7</w:t>
-            </w:r>
-          </w:p>
-        </w:tc>
-        <w:tc>
-          <w:tcPr>
-            <w:tcW w:type="dxa" w:w="3324"/>
-          </w:tcPr>
-          <w:p>
-            <w:r>
-              <w:rPr>
-                <w:sz w:val="18"/>
-              </w:rPr>
-            </w:r>
-            <w:r>
-              <w:rPr>
-                <w:sz w:val="18"/>
-              </w:rPr>
-              <w:t>两份报表数字不同时，行内并列显示原值和新值</w:t>
-            </w:r>
-          </w:p>
-        </w:tc>
-        <w:tc>
-          <w:tcPr>
-            <w:tcW w:type="dxa" w:w="3324"/>
-          </w:tcPr>
-          <w:p>
-            <w:r>
-              <w:rPr>
-                <w:sz w:val="18"/>
-              </w:rPr>
-            </w:r>
-            <w:r>
-              <w:rPr>
-                <w:sz w:val="18"/>
-              </w:rPr>
-              <w:t>归因方案 E9</w:t>
-            </w:r>
-          </w:p>
-        </w:tc>
-      </w:tr>
-      <w:tr>
-        <w:tc>
-          <w:tcPr>
-            <w:tcW w:type="dxa" w:w="3324"/>
-          </w:tcPr>
-          <w:p>
-            <w:r>
-              <w:rPr>
-                <w:sz w:val="18"/>
-              </w:rPr>
-            </w:r>
-            <w:r>
-              <w:rPr>
-                <w:sz w:val="18"/>
-              </w:rPr>
-              <w:t>P1-8</w:t>
-            </w:r>
-          </w:p>
-        </w:tc>
-        <w:tc>
-          <w:tcPr>
-            <w:tcW w:type="dxa" w:w="3324"/>
-          </w:tcPr>
-          <w:p>
-            <w:r>
-              <w:rPr>
-                <w:sz w:val="18"/>
-              </w:rPr>
-            </w:r>
-            <w:r>
-              <w:rPr>
-                <w:sz w:val="18"/>
-              </w:rPr>
-              <w:t>单价设置抽屉：查看和新增未来生效的单价版本（拉新、拉活）</w:t>
-            </w:r>
-          </w:p>
-        </w:tc>
-        <w:tc>
-          <w:tcPr>
-            <w:tcW w:type="dxa" w:w="3324"/>
-          </w:tcPr>
-          <w:p>
-            <w:r>
-              <w:rPr>
-                <w:sz w:val="18"/>
-              </w:rPr>
-            </w:r>
-            <w:r>
-              <w:rPr>
-                <w:sz w:val="18"/>
-              </w:rPr>
-              <w:t>财务方案 3.2</w:t>
-            </w:r>
-          </w:p>
-        </w:tc>
-      </w:tr>
-      <w:tr>
-        <w:tc>
-          <w:tcPr>
-            <w:tcW w:type="dxa" w:w="3324"/>
-          </w:tcPr>
-          <w:p>
-            <w:r>
-              <w:rPr>
-                <w:sz w:val="18"/>
-              </w:rPr>
-            </w:r>
-            <w:r>
-              <w:rPr>
-                <w:sz w:val="18"/>
-              </w:rPr>
-              <w:t>P1-9</w:t>
-            </w:r>
-          </w:p>
-        </w:tc>
-        <w:tc>
-          <w:tcPr>
-            <w:tcW w:type="dxa" w:w="3324"/>
-          </w:tcPr>
-          <w:p>
-            <w:r>
-              <w:rPr>
-                <w:sz w:val="18"/>
-              </w:rPr>
-            </w:r>
-            <w:r>
-              <w:rPr>
-                <w:sz w:val="18"/>
-              </w:rPr>
-              <w:t>管理员本人执行（</w:t>
-            </w:r>
-            <w:r>
-              <w:rPr>
                 <w:rFonts w:ascii="Consolas" w:hAnsi="Consolas"/>
                 <w:sz w:val="18"/>
               </w:rPr>
-              <w:t>staff_self</w:t>
-            </w:r>
-            <w:r>
-              <w:rPr>
-                <w:sz w:val="18"/>
-              </w:rPr>
-              <w:t xml:space="preserve"> 绑定，重建 CHECK 约束）；拉新 10 元、拉活 2 元计入管理员业绩</w:t>
-            </w:r>
-          </w:p>
-        </w:tc>
-        <w:tc>
-          <w:tcPr>
-            <w:tcW w:type="dxa" w:w="3324"/>
-          </w:tcPr>
-          <w:p>
-            <w:r>
-              <w:rPr>
-                <w:sz w:val="18"/>
-              </w:rPr>
-            </w:r>
-            <w:r>
-              <w:rPr>
-                <w:sz w:val="18"/>
-              </w:rPr>
-              <w:t>规则 R5；财务方案 5.1</w:t>
-            </w:r>
-          </w:p>
-        </w:tc>
-      </w:tr>
-      <w:tr>
-        <w:tc>
-          <w:tcPr>
-            <w:tcW w:type="dxa" w:w="3324"/>
-          </w:tcPr>
-          <w:p>
-            <w:r>
-              <w:rPr>
-                <w:sz w:val="18"/>
-              </w:rPr>
-            </w:r>
-            <w:r>
-              <w:rPr>
-                <w:sz w:val="18"/>
-              </w:rPr>
-              <w:t>P1-10</w:t>
-            </w:r>
-          </w:p>
-        </w:tc>
-        <w:tc>
-          <w:tcPr>
-            <w:tcW w:type="dxa" w:w="3324"/>
-          </w:tcPr>
-          <w:p>
-            <w:r>
-              <w:rPr>
-                <w:sz w:val="18"/>
-              </w:rPr>
-            </w:r>
-            <w:r>
-              <w:rPr>
-                <w:sz w:val="18"/>
-              </w:rPr>
-              <w:t>拉活代理名称核对（项目设置中登记代理名称）</w:t>
-            </w:r>
-          </w:p>
-        </w:tc>
-        <w:tc>
-          <w:tcPr>
-            <w:tcW w:type="dxa" w:w="3324"/>
-          </w:tcPr>
-          <w:p>
-            <w:r>
-              <w:rPr>
-                <w:sz w:val="18"/>
-              </w:rPr>
-            </w:r>
-            <w:r>
-              <w:rPr>
-                <w:sz w:val="18"/>
-              </w:rPr>
-              <w:t>归因方案 9.4</w:t>
+              <w:t>creator</w:t>
+            </w:r>
+            <w:r>
+              <w:rPr>
+                <w:sz w:val="18"/>
+              </w:rPr>
+              <w:t>（8.00）</w:t>
             </w:r>
           </w:p>
         </w:tc>
@@ -7496,15 +7307,527 @@
     <w:p/>
     <w:p>
       <w:pPr>
-        <w:pStyle w:val="Heading1"/>
+        <w:pStyle w:val="ListNumber"/>
       </w:pPr>
       <w:r>
-        <w:t>5. P2 平台整合</w:t>
+        <w:t xml:space="preserve">收款义务中记录价格来源 </w:t>
+      </w:r>
+      <w:r>
+        <w:rPr>
+          <w:rFonts w:ascii="Consolas" w:hAnsi="Consolas"/>
+          <w:sz w:val="19"/>
+        </w:rPr>
+        <w:t>priceSource: 'agreement' | 'role_rate'</w:t>
+      </w:r>
+      <w:r>
+        <w:t>，抽屉和明细中显示“按成员报价”或“按角色单价”。</w:t>
       </w:r>
     </w:p>
     <w:p>
-      <w:r>
-        <w:t>按平台方案第 4–8 节：按角色的导航与首页待办、平台“我的收益”（分类型）、拉新迁移到角色单价（8 / 8.5 / 10 / 0.5）、小程序收益页按类型展示、旧资金页面收进“历史账目”。</w:t>
+      <w:pPr>
+        <w:pStyle w:val="ListNumber"/>
+      </w:pPr>
+      <w:r>
+        <w:rPr>
+          <w:rFonts w:ascii="Consolas" w:hAnsi="Consolas"/>
+          <w:sz w:val="19"/>
+        </w:rPr>
+        <w:t>pricing.ts</w:t>
+      </w:r>
+      <w:r>
+        <w:t xml:space="preserve"> 第 38 行和第 106 行，“直属达人必须上级为空”改为使用 </w:t>
+      </w:r>
+      <w:r>
+        <w:rPr>
+          <w:rFonts w:ascii="Consolas" w:hAnsi="Consolas"/>
+          <w:sz w:val="19"/>
+        </w:rPr>
+        <w:t>independentCreatorSql()</w:t>
+      </w:r>
+      <w:r>
+        <w:t>：上级是管理员的达人也算直属达人，可以单独报价。</w:t>
+      </w:r>
+    </w:p>
+    <w:p>
+      <w:pPr>
+        <w:pStyle w:val="ListNumber"/>
+      </w:pPr>
+      <w:r>
+        <w:t xml:space="preserve">上线后执行一次：对 </w:t>
+      </w:r>
+      <w:r>
+        <w:rPr>
+          <w:rFonts w:ascii="Consolas" w:hAnsi="Consolas"/>
+          <w:sz w:val="19"/>
+        </w:rPr>
+        <w:t>reason_code IN ('PRICE_MISSING','PRICE_OVERLAP')</w:t>
+      </w:r>
+      <w:r>
+        <w:t xml:space="preserve"> 且</w:t>
+      </w:r>
+      <w:r>
+        <w:rPr>
+          <w:b/>
+        </w:rPr>
+        <w:t>未确认</w:t>
+      </w:r>
+      <w:r>
+        <w:t>的拉新事实重新归因（可以合并到 P0-8 的修复脚本，同样默认只预览）。</w:t>
+      </w:r>
+    </w:p>
+    <w:p>
+      <w:r>
+        <w:rPr>
+          <w:b/>
+        </w:rPr>
+        <w:t>验收</w:t>
+      </w:r>
+      <w:r>
+        <w:t>：</w:t>
+      </w:r>
+    </w:p>
+    <w:p>
+      <w:pPr>
+        <w:pStyle w:val="ListBullet"/>
+      </w:pPr>
+      <w:r>
+        <w:t>已有报价的成员：金额与改动前完全一致（L1）。</w:t>
+      </w:r>
+    </w:p>
+    <w:p>
+      <w:pPr>
+        <w:pStyle w:val="ListBullet"/>
+      </w:pPr>
+      <w:r>
+        <w:t>新加入、未设报价的团队达人做了 10 单：达人 80.00，团长 5.00；明细显示“按角色单价”。</w:t>
+      </w:r>
+    </w:p>
+    <w:p>
+      <w:pPr>
+        <w:pStyle w:val="ListBullet"/>
+      </w:pPr>
+      <w:r>
+        <w:t>上级是管理员的达人：不再缺价。</w:t>
+      </w:r>
+    </w:p>
+    <w:p>
+      <w:pPr>
+        <w:pStyle w:val="ListBullet"/>
+      </w:pPr>
+      <w:r>
+        <w:t>已确认的账不变。</w:t>
+      </w:r>
+    </w:p>
+    <w:p>
+      <w:pPr>
+        <w:pStyle w:val="Heading2"/>
+      </w:pPr>
+      <w:r>
+        <w:t>P0-10 导航清理与三个小问题</w:t>
+      </w:r>
+    </w:p>
+    <w:p>
+      <w:r>
+        <w:rPr>
+          <w:b/>
+        </w:rPr>
+        <w:t>问题</w:t>
+      </w:r>
+      <w:r>
+        <w:t>：占位页、旧资金页面挂在导航上；按钮名和页面标题对不上；已入团的达人仍看到入团申请表（平台方案第 2 节、阶段 0）。</w:t>
+      </w:r>
+    </w:p>
+    <w:p>
+      <w:r>
+        <w:rPr>
+          <w:b/>
+        </w:rPr>
+        <w:t>改动</w:t>
+      </w:r>
+      <w:r>
+        <w:t>（只改导航和显示，保留所有路由，不删除任何功能代码）：</w:t>
+      </w:r>
+    </w:p>
+    <w:p>
+      <w:pPr>
+        <w:pStyle w:val="ListNumber"/>
+      </w:pPr>
+      <w:r>
+        <w:rPr>
+          <w:b/>
+        </w:rPr>
+        <w:t>从导航和“更多功能”中移除</w:t>
+      </w:r>
+      <w:r>
+        <w:t>：订单管理、知识付费、创意工具坊（占位页），以及结算管理、收益结算、提现审批、财务申诉（旧资金流程）。旧地址仍能打开，页面顶部显示“这个功能已合并到‘财务做账’（或‘收入与提现’）”和前往按钮。</w:t>
+      </w:r>
+    </w:p>
+    <w:p>
+      <w:pPr>
+        <w:pStyle w:val="ListNumber"/>
+      </w:pPr>
+      <w:r>
+        <w:rPr>
+          <w:b/>
+        </w:rPr>
+        <w:t>按钮名与页面标题统一</w:t>
+      </w:r>
+      <w:r>
+        <w:t>，以按钮名为准，修改页面标题：</w:t>
+      </w:r>
+    </w:p>
+    <w:tbl>
+      <w:tblPr>
+        <w:tblStyle w:val="TableGrid"/>
+        <w:tblW w:type="auto" w:w="0"/>
+        <w:jc w:val="center"/>
+        <w:tblLook w:firstColumn="1" w:firstRow="1" w:lastColumn="0" w:lastRow="0" w:noHBand="0" w:noVBand="1" w:val="04A0"/>
+      </w:tblPr>
+      <w:tblGrid>
+        <w:gridCol w:w="4986"/>
+        <w:gridCol w:w="4986"/>
+      </w:tblGrid>
+      <w:tr>
+        <w:tc>
+          <w:tcPr>
+            <w:tcW w:type="dxa" w:w="4986"/>
+          </w:tcPr>
+          <w:p>
+            <w:r>
+              <w:rPr>
+                <w:b/>
+                <w:sz w:val="18"/>
+              </w:rPr>
+            </w:r>
+            <w:r>
+              <w:rPr>
+                <w:b/>
+                <w:sz w:val="18"/>
+              </w:rPr>
+              <w:t>按钮</w:t>
+            </w:r>
+          </w:p>
+        </w:tc>
+        <w:tc>
+          <w:tcPr>
+            <w:tcW w:type="dxa" w:w="4986"/>
+          </w:tcPr>
+          <w:p>
+            <w:r>
+              <w:rPr>
+                <w:b/>
+                <w:sz w:val="18"/>
+              </w:rPr>
+            </w:r>
+            <w:r>
+              <w:rPr>
+                <w:b/>
+                <w:sz w:val="18"/>
+              </w:rPr>
+              <w:t>页面标题改为</w:t>
+            </w:r>
+          </w:p>
+        </w:tc>
+      </w:tr>
+      <w:tr>
+        <w:tc>
+          <w:tcPr>
+            <w:tcW w:type="dxa" w:w="4986"/>
+          </w:tcPr>
+          <w:p>
+            <w:r>
+              <w:rPr>
+                <w:sz w:val="18"/>
+              </w:rPr>
+            </w:r>
+            <w:r>
+              <w:rPr>
+                <w:sz w:val="18"/>
+              </w:rPr>
+              <w:t>关键词与团队</w:t>
+            </w:r>
+          </w:p>
+        </w:tc>
+        <w:tc>
+          <w:tcPr>
+            <w:tcW w:type="dxa" w:w="4986"/>
+          </w:tcPr>
+          <w:p>
+            <w:r>
+              <w:rPr>
+                <w:sz w:val="18"/>
+              </w:rPr>
+            </w:r>
+            <w:r>
+              <w:rPr>
+                <w:sz w:val="18"/>
+              </w:rPr>
+              <w:t>关键词与团队（团长看到“团队业务”，达人看到“我的关键词”，按钮与标题同步）</w:t>
+            </w:r>
+          </w:p>
+        </w:tc>
+      </w:tr>
+      <w:tr>
+        <w:tc>
+          <w:tcPr>
+            <w:tcW w:type="dxa" w:w="4986"/>
+          </w:tcPr>
+          <w:p>
+            <w:r>
+              <w:rPr>
+                <w:sz w:val="18"/>
+              </w:rPr>
+            </w:r>
+            <w:r>
+              <w:rPr>
+                <w:sz w:val="18"/>
+              </w:rPr>
+              <w:t>作品管理</w:t>
+            </w:r>
+          </w:p>
+        </w:tc>
+        <w:tc>
+          <w:tcPr>
+            <w:tcW w:type="dxa" w:w="4986"/>
+          </w:tcPr>
+          <w:p>
+            <w:r>
+              <w:rPr>
+                <w:sz w:val="18"/>
+              </w:rPr>
+            </w:r>
+            <w:r>
+              <w:rPr>
+                <w:sz w:val="18"/>
+              </w:rPr>
+              <w:t>作品管理</w:t>
+            </w:r>
+          </w:p>
+        </w:tc>
+      </w:tr>
+      <w:tr>
+        <w:tc>
+          <w:tcPr>
+            <w:tcW w:type="dxa" w:w="4986"/>
+          </w:tcPr>
+          <w:p>
+            <w:r>
+              <w:rPr>
+                <w:sz w:val="18"/>
+              </w:rPr>
+            </w:r>
+            <w:r>
+              <w:rPr>
+                <w:sz w:val="18"/>
+              </w:rPr>
+              <w:t>数据看板</w:t>
+            </w:r>
+          </w:p>
+        </w:tc>
+        <w:tc>
+          <w:tcPr>
+            <w:tcW w:type="dxa" w:w="4986"/>
+          </w:tcPr>
+          <w:p>
+            <w:r>
+              <w:rPr>
+                <w:sz w:val="18"/>
+              </w:rPr>
+            </w:r>
+            <w:r>
+              <w:rPr>
+                <w:sz w:val="18"/>
+              </w:rPr>
+              <w:t>数据看板</w:t>
+            </w:r>
+          </w:p>
+        </w:tc>
+      </w:tr>
+      <w:tr>
+        <w:tc>
+          <w:tcPr>
+            <w:tcW w:type="dxa" w:w="4986"/>
+          </w:tcPr>
+          <w:p>
+            <w:r>
+              <w:rPr>
+                <w:sz w:val="18"/>
+              </w:rPr>
+            </w:r>
+            <w:r>
+              <w:rPr>
+                <w:sz w:val="18"/>
+              </w:rPr>
+              <w:t>团队与成员</w:t>
+            </w:r>
+          </w:p>
+        </w:tc>
+        <w:tc>
+          <w:tcPr>
+            <w:tcW w:type="dxa" w:w="4986"/>
+          </w:tcPr>
+          <w:p>
+            <w:r>
+              <w:rPr>
+                <w:sz w:val="18"/>
+              </w:rPr>
+            </w:r>
+            <w:r>
+              <w:rPr>
+                <w:sz w:val="18"/>
+              </w:rPr>
+              <w:t>团队与成员</w:t>
+            </w:r>
+          </w:p>
+        </w:tc>
+      </w:tr>
+      <w:tr>
+        <w:tc>
+          <w:tcPr>
+            <w:tcW w:type="dxa" w:w="4986"/>
+          </w:tcPr>
+          <w:p>
+            <w:r>
+              <w:rPr>
+                <w:sz w:val="18"/>
+              </w:rPr>
+            </w:r>
+            <w:r>
+              <w:rPr>
+                <w:sz w:val="18"/>
+              </w:rPr>
+              <w:t>运营账户</w:t>
+            </w:r>
+          </w:p>
+        </w:tc>
+        <w:tc>
+          <w:tcPr>
+            <w:tcW w:type="dxa" w:w="4986"/>
+          </w:tcPr>
+          <w:p>
+            <w:r>
+              <w:rPr>
+                <w:sz w:val="18"/>
+              </w:rPr>
+            </w:r>
+            <w:r>
+              <w:rPr>
+                <w:sz w:val="18"/>
+              </w:rPr>
+              <w:t>运营账户</w:t>
+            </w:r>
+          </w:p>
+        </w:tc>
+      </w:tr>
+      <w:tr>
+        <w:tc>
+          <w:tcPr>
+            <w:tcW w:type="dxa" w:w="4986"/>
+          </w:tcPr>
+          <w:p>
+            <w:r>
+              <w:rPr>
+                <w:sz w:val="18"/>
+              </w:rPr>
+            </w:r>
+            <w:r>
+              <w:rPr>
+                <w:sz w:val="18"/>
+              </w:rPr>
+              <w:t>业务项目</w:t>
+            </w:r>
+          </w:p>
+        </w:tc>
+        <w:tc>
+          <w:tcPr>
+            <w:tcW w:type="dxa" w:w="4986"/>
+          </w:tcPr>
+          <w:p>
+            <w:r>
+              <w:rPr>
+                <w:sz w:val="18"/>
+              </w:rPr>
+            </w:r>
+            <w:r>
+              <w:rPr>
+                <w:sz w:val="18"/>
+              </w:rPr>
+              <w:t>业务项目</w:t>
+            </w:r>
+          </w:p>
+        </w:tc>
+      </w:tr>
+    </w:tbl>
+    <w:p/>
+    <w:p>
+      <w:pPr>
+        <w:pStyle w:val="ListNumber"/>
+      </w:pPr>
+      <w:r>
+        <w:rPr>
+          <w:b/>
+        </w:rPr>
+        <w:t>关键词页顶部“本地业务词库……本地记录 6 创建成功 6 待提交 0……”整块删除</w:t>
+      </w:r>
+      <w:r>
+        <w:t>；只有提交知乎失败时，显示一行“N 个关键词提交知乎失败”，附【重试】按钮。</w:t>
+      </w:r>
+    </w:p>
+    <w:p>
+      <w:pPr>
+        <w:pStyle w:val="ListNumber"/>
+      </w:pPr>
+      <w:r>
+        <w:rPr>
+          <w:b/>
+        </w:rPr>
+        <w:t>已入团的达人</w:t>
+      </w:r>
+      <w:r>
+        <w:t>：“加入团队”页只显示当前团队信息，不显示入团申请表；左侧栏的“加入团队”改名为“我的团队”。</w:t>
+      </w:r>
+    </w:p>
+    <w:p>
+      <w:pPr>
+        <w:pStyle w:val="ListNumber"/>
+      </w:pPr>
+      <w:r>
+        <w:rPr>
+          <w:b/>
+        </w:rPr>
+        <w:t>小程序“工具”页</w:t>
+      </w:r>
+      <w:r>
+        <w:t>：不可用的 5 个工具不显示；“数据查询”改名为“收入与提现”。</w:t>
+      </w:r>
+    </w:p>
+    <w:p>
+      <w:pPr>
+        <w:pStyle w:val="ListNumber"/>
+      </w:pPr>
+      <w:r>
+        <w:t>工作台和知乎页面重复的“操作引导”只保留工作台一处。</w:t>
+      </w:r>
+    </w:p>
+    <w:p>
+      <w:r>
+        <w:rPr>
+          <w:b/>
+        </w:rPr>
+        <w:t>验收</w:t>
+      </w:r>
+      <w:r>
+        <w:t xml:space="preserve">：四个演示账号逐一登录，截图确认导航里没有上述页面；旧地址能打开并看到合并提示；已入团的小李看不到入团申请表；小程序测试 </w:t>
+      </w:r>
+      <w:r>
+        <w:rPr>
+          <w:rFonts w:ascii="Consolas" w:hAnsi="Consolas"/>
+          <w:sz w:val="19"/>
+        </w:rPr>
+        <w:t>cd weixin-app &amp;&amp; npm test</w:t>
+      </w:r>
+      <w:r>
+        <w:t xml:space="preserve"> 通过。</w:t>
       </w:r>
     </w:p>
     <w:p>
@@ -7512,7 +7835,12 @@
         <w:pStyle w:val="Heading1"/>
       </w:pPr>
       <w:r>
-        <w:t>6. 验收用例（P0）</w:t>
+        <w:t>4. P1 体验重做（P0 完成后）</w:t>
+      </w:r>
+    </w:p>
+    <w:p>
+      <w:r>
+        <w:t>按归因方案第 4、5 节和原型实现，要点如下：</w:t>
       </w:r>
     </w:p>
     <w:tbl>
@@ -7564,7 +7892,7 @@
                 <w:b/>
                 <w:sz w:val="18"/>
               </w:rPr>
-              <w:t>场景</w:t>
+              <w:t>内容</w:t>
             </w:r>
           </w:p>
         </w:tc>
@@ -7584,7 +7912,7 @@
                 <w:b/>
                 <w:sz w:val="18"/>
               </w:rPr>
-              <w:t>期望</w:t>
+              <w:t>依据</w:t>
             </w:r>
           </w:p>
         </w:tc>
@@ -7604,7 +7932,7 @@
               <w:rPr>
                 <w:sz w:val="18"/>
               </w:rPr>
-              <w:t>L1</w:t>
+              <w:t>P1-1</w:t>
             </w:r>
           </w:p>
         </w:tc>
@@ -7620,16 +7948,35 @@
             </w:r>
             <w:r>
               <w:rPr>
-                <w:b/>
-                <w:sz w:val="18"/>
-              </w:rPr>
-              <w:t>拉新回归</w:t>
-            </w:r>
-            <w:r>
-              <w:rPr>
-                <w:sz w:val="18"/>
-              </w:rPr>
-              <w:t>：选“拉新订单”，上传知乎官方订单样例和演示报表</w:t>
+                <w:sz w:val="18"/>
+              </w:rPr>
+              <w:t xml:space="preserve">平台共享组件：分析过程面板 </w:t>
+            </w:r>
+            <w:r>
+              <w:rPr>
+                <w:rFonts w:ascii="Consolas" w:hAnsi="Consolas"/>
+                <w:sz w:val="18"/>
+              </w:rPr>
+              <w:t>AnalysisRun.vue</w:t>
+            </w:r>
+            <w:r>
+              <w:rPr>
+                <w:sz w:val="18"/>
+              </w:rPr>
+              <w:t xml:space="preserve">、多维表格 </w:t>
+            </w:r>
+            <w:r>
+              <w:rPr>
+                <w:rFonts w:ascii="Consolas" w:hAnsi="Consolas"/>
+                <w:sz w:val="18"/>
+              </w:rPr>
+              <w:t>DataGrid.vue</w:t>
+            </w:r>
+            <w:r>
+              <w:rPr>
+                <w:sz w:val="18"/>
+              </w:rPr>
+              <w:t>（视图、分组、状态标签、下一步列、底部合计、行抽屉、窄屏卡片）</w:t>
             </w:r>
           </w:p>
         </w:tc>
@@ -7647,7 +7994,7 @@
               <w:rPr>
                 <w:sz w:val="18"/>
               </w:rPr>
-              <w:t>解析、计价、确认结果与改动前完全一致</w:t>
+              <w:t>规范 5.1、5.2；原型</w:t>
             </w:r>
           </w:p>
         </w:tc>
@@ -7667,7 +8014,7 @@
               <w:rPr>
                 <w:sz w:val="18"/>
               </w:rPr>
-              <w:t>L2</w:t>
+              <w:t>P1-2</w:t>
             </w:r>
           </w:p>
         </w:tc>
@@ -7685,7 +8032,27 @@
               <w:rPr>
                 <w:sz w:val="18"/>
               </w:rPr>
-              <w:t>选“拉活”，上传拉活表：浩浩哑女 1 个，执行人为王团长的团队达人小李</w:t>
+              <w:t xml:space="preserve">分析记录接口 </w:t>
+            </w:r>
+            <w:r>
+              <w:rPr>
+                <w:rFonts w:ascii="Consolas" w:hAnsi="Consolas"/>
+                <w:sz w:val="18"/>
+              </w:rPr>
+              <w:t>GET /imports/:id/analysis</w:t>
+            </w:r>
+            <w:r>
+              <w:rPr>
+                <w:sz w:val="18"/>
+              </w:rPr>
+              <w:t>、</w:t>
+            </w:r>
+            <w:r>
+              <w:rPr>
+                <w:rFonts w:ascii="Consolas" w:hAnsi="Consolas"/>
+                <w:sz w:val="18"/>
+              </w:rPr>
+              <w:t>POST /imports/:id/answers</w:t>
             </w:r>
           </w:p>
         </w:tc>
@@ -7703,7 +8070,7 @@
               <w:rPr>
                 <w:sz w:val="18"/>
               </w:rPr>
-              <w:t>小李 ¥1.20，王团长 ¥0.40</w:t>
+              <w:t>归因方案 5.1</w:t>
             </w:r>
           </w:p>
         </w:tc>
@@ -7723,7 +8090,7 @@
               <w:rPr>
                 <w:sz w:val="18"/>
               </w:rPr>
-              <w:t>L3</w:t>
+              <w:t>P1-3</w:t>
             </w:r>
           </w:p>
         </w:tc>
@@ -7741,7 +8108,7 @@
               <w:rPr>
                 <w:sz w:val="18"/>
               </w:rPr>
-              <w:t>同一天同一关键词：拉新 3 单、拉活 5 个</w:t>
+              <w:t>渠道和关键词名称归一化与相近候选，就地确认</w:t>
             </w:r>
           </w:p>
         </w:tc>
@@ -7759,7 +8126,7 @@
               <w:rPr>
                 <w:sz w:val="18"/>
               </w:rPr>
-              <w:t>两类各一条，分别显示、分别计价，互不覆盖</w:t>
+              <w:t>归因方案 E5、E6、4.4</w:t>
             </w:r>
           </w:p>
         </w:tc>
@@ -7779,7 +8146,7 @@
               <w:rPr>
                 <w:sz w:val="18"/>
               </w:rPr>
-              <w:t>L4</w:t>
+              <w:t>P1-4</w:t>
             </w:r>
           </w:p>
         </w:tc>
@@ -7797,7 +8164,7 @@
               <w:rPr>
                 <w:sz w:val="18"/>
               </w:rPr>
-              <w:t>拉新已确认后上传同日拉活</w:t>
+              <w:t>登记历史关键词（不推送知乎）</w:t>
             </w:r>
           </w:p>
         </w:tc>
@@ -7815,7 +8182,7 @@
               <w:rPr>
                 <w:sz w:val="18"/>
               </w:rPr>
-              <w:t>拉新已确认金额不变，拉活单独待确认</w:t>
+              <w:t>平台方案 F7</w:t>
             </w:r>
           </w:p>
         </w:tc>
@@ -7835,7 +8202,7 @@
               <w:rPr>
                 <w:sz w:val="18"/>
               </w:rPr>
-              <w:t>L5</w:t>
+              <w:t>P1-5</w:t>
             </w:r>
           </w:p>
         </w:tc>
@@ -7853,7 +8220,7 @@
               <w:rPr>
                 <w:sz w:val="18"/>
               </w:rPr>
-              <w:t>选“拉新订单”上传拉活表</w:t>
+              <w:t>修复动作完成后自动重算（渠道确认、作品核验、单价发布、补录归属）</w:t>
             </w:r>
           </w:p>
         </w:tc>
@@ -7871,7 +8238,7 @@
               <w:rPr>
                 <w:sz w:val="18"/>
               </w:rPr>
-              <w:t>提示“看起来是拉活表”，点【按拉活处理】后成功</w:t>
+              <w:t>平台方案 6.2</w:t>
             </w:r>
           </w:p>
         </w:tc>
@@ -7891,7 +8258,7 @@
               <w:rPr>
                 <w:sz w:val="18"/>
               </w:rPr>
-              <w:t>L6</w:t>
+              <w:t>P1-6</w:t>
             </w:r>
           </w:p>
         </w:tc>
@@ -7909,7 +8276,7 @@
               <w:rPr>
                 <w:sz w:val="18"/>
               </w:rPr>
-              <w:t>拉活表结算金额 3.00、拉活量 1</w:t>
+              <w:t>风险判定：照常计价、阻止确认、人工核实</w:t>
             </w:r>
           </w:p>
         </w:tc>
@@ -7927,7 +8294,7 @@
               <w:rPr>
                 <w:sz w:val="18"/>
               </w:rPr>
-              <w:t>按 1 × 单价计算，金额旁提示结算金额对不上</w:t>
+              <w:t>归因方案 E7</w:t>
             </w:r>
           </w:p>
         </w:tc>
@@ -7947,7 +8314,7 @@
               <w:rPr>
                 <w:sz w:val="18"/>
               </w:rPr>
-              <w:t>L7</w:t>
+              <w:t>P1-7</w:t>
             </w:r>
           </w:p>
         </w:tc>
@@ -7965,14 +8332,7 @@
               <w:rPr>
                 <w:sz w:val="18"/>
               </w:rPr>
-              <w:t xml:space="preserve">拉活表表头为“统计日期 / 渠道 / 关键字 / 拉活数 / 补贴金额”，日期写成 </w:t>
-            </w:r>
-            <w:r>
-              <w:rPr>
-                <w:rFonts w:ascii="Consolas" w:hAnsi="Consolas"/>
-                <w:sz w:val="18"/>
-              </w:rPr>
-              <w:t>2026年9月14日</w:t>
+              <w:t>两份报表数字不同时，行内并列显示原值和新值</w:t>
             </w:r>
           </w:p>
         </w:tc>
@@ -7990,7 +8350,7 @@
               <w:rPr>
                 <w:sz w:val="18"/>
               </w:rPr>
-              <w:t>正常识别</w:t>
+              <w:t>归因方案 E9</w:t>
             </w:r>
           </w:p>
         </w:tc>
@@ -8010,7 +8370,7 @@
               <w:rPr>
                 <w:sz w:val="18"/>
               </w:rPr>
-              <w:t>L8</w:t>
+              <w:t>P1-8</w:t>
             </w:r>
           </w:p>
         </w:tc>
@@ -8028,7 +8388,7 @@
               <w:rPr>
                 <w:sz w:val="18"/>
               </w:rPr>
-              <w:t>拉活表保存为 GBK 编码的 .csv</w:t>
+              <w:t>单价设置抽屉：查看和新增未来生效的单价版本（拉新、拉活）</w:t>
             </w:r>
           </w:p>
         </w:tc>
@@ -8046,7 +8406,7 @@
               <w:rPr>
                 <w:sz w:val="18"/>
               </w:rPr>
-              <w:t>正常识别</w:t>
+              <w:t>财务方案 3.2</w:t>
             </w:r>
           </w:p>
         </w:tc>
@@ -8066,7 +8426,7 @@
               <w:rPr>
                 <w:sz w:val="18"/>
               </w:rPr>
-              <w:t>L9</w:t>
+              <w:t>P1-9</w:t>
             </w:r>
           </w:p>
         </w:tc>
@@ -8084,7 +8444,20 @@
               <w:rPr>
                 <w:sz w:val="18"/>
               </w:rPr>
-              <w:t>团长本人执行的拉活 2 个</w:t>
+              <w:t>管理员本人执行（</w:t>
+            </w:r>
+            <w:r>
+              <w:rPr>
+                <w:rFonts w:ascii="Consolas" w:hAnsi="Consolas"/>
+                <w:sz w:val="18"/>
+              </w:rPr>
+              <w:t>staff_self</w:t>
+            </w:r>
+            <w:r>
+              <w:rPr>
+                <w:sz w:val="18"/>
+              </w:rPr>
+              <w:t xml:space="preserve"> 绑定，重建 CHECK 约束）；拉新 10 元、拉活 2 元计入管理员业绩</w:t>
             </w:r>
           </w:p>
         </w:tc>
@@ -8102,7 +8475,7 @@
               <w:rPr>
                 <w:sz w:val="18"/>
               </w:rPr>
-              <w:t>团长 ¥3.20</w:t>
+              <w:t>规则 R5；财务方案 5.1</w:t>
             </w:r>
           </w:p>
         </w:tc>
@@ -8122,7 +8495,7 @@
               <w:rPr>
                 <w:sz w:val="18"/>
               </w:rPr>
-              <w:t>L10</w:t>
+              <w:t>P1-10</w:t>
             </w:r>
           </w:p>
         </w:tc>
@@ -8140,7 +8513,7 @@
               <w:rPr>
                 <w:sz w:val="18"/>
               </w:rPr>
-              <w:t>独立达人小陈的拉活 3 个</w:t>
+              <w:t>拉活代理名称核对（项目设置中登记代理名称）</w:t>
             </w:r>
           </w:p>
         </w:tc>
@@ -8158,7 +8531,104 @@
               <w:rPr>
                 <w:sz w:val="18"/>
               </w:rPr>
-              <w:t>小陈 ¥3.60</w:t>
+              <w:t>归因方案 9.4</w:t>
+            </w:r>
+          </w:p>
+        </w:tc>
+      </w:tr>
+    </w:tbl>
+    <w:p/>
+    <w:p>
+      <w:pPr>
+        <w:pStyle w:val="Heading1"/>
+      </w:pPr>
+      <w:r>
+        <w:t>5. P2 平台整合</w:t>
+      </w:r>
+    </w:p>
+    <w:p>
+      <w:r>
+        <w:t>按平台方案第 4–8 节：按角色的导航与首页待办、平台“我的收益”（分类型）、拉新迁移到角色单价（8 / 8.5 / 10 / 0.5）、小程序收益页按类型展示、旧资金页面收进“历史账目”。</w:t>
+      </w:r>
+    </w:p>
+    <w:p>
+      <w:pPr>
+        <w:pStyle w:val="Heading1"/>
+      </w:pPr>
+      <w:r>
+        <w:t>6. 验收用例（P0）</w:t>
+      </w:r>
+    </w:p>
+    <w:tbl>
+      <w:tblPr>
+        <w:tblStyle w:val="TableGrid"/>
+        <w:tblW w:type="auto" w:w="0"/>
+        <w:jc w:val="center"/>
+        <w:tblLook w:firstColumn="1" w:firstRow="1" w:lastColumn="0" w:lastRow="0" w:noHBand="0" w:noVBand="1" w:val="04A0"/>
+      </w:tblPr>
+      <w:tblGrid>
+        <w:gridCol w:w="3324"/>
+        <w:gridCol w:w="3324"/>
+        <w:gridCol w:w="3324"/>
+      </w:tblGrid>
+      <w:tr>
+        <w:tc>
+          <w:tcPr>
+            <w:tcW w:type="dxa" w:w="3324"/>
+          </w:tcPr>
+          <w:p>
+            <w:r>
+              <w:rPr>
+                <w:b/>
+                <w:sz w:val="18"/>
+              </w:rPr>
+            </w:r>
+            <w:r>
+              <w:rPr>
+                <w:b/>
+                <w:sz w:val="18"/>
+              </w:rPr>
+              <w:t>编号</w:t>
+            </w:r>
+          </w:p>
+        </w:tc>
+        <w:tc>
+          <w:tcPr>
+            <w:tcW w:type="dxa" w:w="3324"/>
+          </w:tcPr>
+          <w:p>
+            <w:r>
+              <w:rPr>
+                <w:b/>
+                <w:sz w:val="18"/>
+              </w:rPr>
+            </w:r>
+            <w:r>
+              <w:rPr>
+                <w:b/>
+                <w:sz w:val="18"/>
+              </w:rPr>
+              <w:t>场景</w:t>
+            </w:r>
+          </w:p>
+        </w:tc>
+        <w:tc>
+          <w:tcPr>
+            <w:tcW w:type="dxa" w:w="3324"/>
+          </w:tcPr>
+          <w:p>
+            <w:r>
+              <w:rPr>
+                <w:b/>
+                <w:sz w:val="18"/>
+              </w:rPr>
+            </w:r>
+            <w:r>
+              <w:rPr>
+                <w:b/>
+                <w:sz w:val="18"/>
+              </w:rPr>
+              <w:t>期望</w:t>
             </w:r>
           </w:p>
         </w:tc>
@@ -8178,7 +8648,7 @@
               <w:rPr>
                 <w:sz w:val="18"/>
               </w:rPr>
-              <w:t>L11</w:t>
+              <w:t>L1</w:t>
             </w:r>
           </w:p>
         </w:tc>
@@ -8194,9 +8664,16 @@
             </w:r>
             <w:r>
               <w:rPr>
-                <w:sz w:val="18"/>
-              </w:rPr>
-              <w:t>管理员本人执行的拉活（P1-9 之后）</w:t>
+                <w:b/>
+                <w:sz w:val="18"/>
+              </w:rPr>
+              <w:t>拉新回归</w:t>
+            </w:r>
+            <w:r>
+              <w:rPr>
+                <w:sz w:val="18"/>
+              </w:rPr>
+              <w:t>：选“拉新订单”，上传知乎官方订单样例和演示报表</w:t>
             </w:r>
           </w:p>
         </w:tc>
@@ -8214,7 +8691,7 @@
               <w:rPr>
                 <w:sz w:val="18"/>
               </w:rPr>
-              <w:t>管理员业绩 ¥2.00 / 个，不进入应付合计和待开放款项</w:t>
+              <w:t>解析、计价、确认结果与改动前完全一致</w:t>
             </w:r>
           </w:p>
         </w:tc>
@@ -8234,7 +8711,7 @@
               <w:rPr>
                 <w:sz w:val="18"/>
               </w:rPr>
-              <w:t>L12</w:t>
+              <w:t>L2</w:t>
             </w:r>
           </w:p>
         </w:tc>
@@ -8252,14 +8729,7 @@
               <w:rPr>
                 <w:sz w:val="18"/>
               </w:rPr>
-              <w:t xml:space="preserve">运营职责管理员请求 </w:t>
-            </w:r>
-            <w:r>
-              <w:rPr>
-                <w:rFonts w:ascii="Consolas" w:hAnsi="Consolas"/>
-                <w:sz w:val="18"/>
-              </w:rPr>
-              <w:t>/workbench</w:t>
+              <w:t>选“拉活”，上传拉活表：浩浩哑女 1 个，执行人为王团长的团队达人小李</w:t>
             </w:r>
           </w:p>
         </w:tc>
@@ -8277,7 +8747,7 @@
               <w:rPr>
                 <w:sz w:val="18"/>
               </w:rPr>
-              <w:t>403</w:t>
+              <w:t>小李 ¥1.20，王团长 ¥0.40</w:t>
             </w:r>
           </w:p>
         </w:tc>
@@ -8297,7 +8767,7 @@
               <w:rPr>
                 <w:sz w:val="18"/>
               </w:rPr>
-              <w:t>L13</w:t>
+              <w:t>L3</w:t>
             </w:r>
           </w:p>
         </w:tc>
@@ -8315,14 +8785,7 @@
               <w:rPr>
                 <w:sz w:val="18"/>
               </w:rPr>
-              <w:t xml:space="preserve">团长请求 </w:t>
-            </w:r>
-            <w:r>
-              <w:rPr>
-                <w:rFonts w:ascii="Consolas" w:hAnsi="Consolas"/>
-                <w:sz w:val="18"/>
-              </w:rPr>
-              <w:t>/workbench</w:t>
+              <w:t>同一天同一关键词：拉新 3 单、拉活 5 个</w:t>
             </w:r>
           </w:p>
         </w:tc>
@@ -8340,7 +8803,7 @@
               <w:rPr>
                 <w:sz w:val="18"/>
               </w:rPr>
-              <w:t>看不到团队达人的个人金额</w:t>
+              <w:t>两类各一条，分别显示、分别计价，互不覆盖</w:t>
             </w:r>
           </w:p>
         </w:tc>
@@ -8360,7 +8823,7 @@
               <w:rPr>
                 <w:sz w:val="18"/>
               </w:rPr>
-              <w:t>L14</w:t>
+              <w:t>L4</w:t>
             </w:r>
           </w:p>
         </w:tc>
@@ -8378,7 +8841,7 @@
               <w:rPr>
                 <w:sz w:val="18"/>
               </w:rPr>
-              <w:t>报表含“合计”行、1 行日期错误</w:t>
+              <w:t>拉新已确认后上传同日拉活</w:t>
             </w:r>
           </w:p>
         </w:tc>
@@ -8396,7 +8859,7 @@
               <w:rPr>
                 <w:sz w:val="18"/>
               </w:rPr>
-              <w:t>合计行跳过，错误行单独显示原因，其余正常</w:t>
+              <w:t>拉新已确认金额不变，拉活单独待确认</w:t>
             </w:r>
           </w:p>
         </w:tc>
@@ -8416,7 +8879,7 @@
               <w:rPr>
                 <w:sz w:val="18"/>
               </w:rPr>
-              <w:t>L15</w:t>
+              <w:t>L5</w:t>
             </w:r>
           </w:p>
         </w:tc>
@@ -8434,7 +8897,7 @@
               <w:rPr>
                 <w:sz w:val="18"/>
               </w:rPr>
-              <w:t>首次上传后上传更早日期（旧系统无数据）</w:t>
+              <w:t>选“拉新订单”上传拉活表</w:t>
             </w:r>
           </w:p>
         </w:tc>
@@ -8452,7 +8915,7 @@
               <w:rPr>
                 <w:sz w:val="18"/>
               </w:rPr>
-              <w:t>正常计算，生效日前移</w:t>
+              <w:t>提示“看起来是拉活表”，点【按拉活处理】后成功</w:t>
             </w:r>
           </w:p>
         </w:tc>
@@ -8472,7 +8935,7 @@
               <w:rPr>
                 <w:sz w:val="18"/>
               </w:rPr>
-              <w:t>L16</w:t>
+              <w:t>L6</w:t>
             </w:r>
           </w:p>
         </w:tc>
@@ -8490,7 +8953,7 @@
               <w:rPr>
                 <w:sz w:val="18"/>
               </w:rPr>
-              <w:t>没有执行人的关键词，补录执行人</w:t>
+              <w:t>拉活表结算金额 3.00、拉活量 1</w:t>
             </w:r>
           </w:p>
         </w:tc>
@@ -8508,7 +8971,700 @@
               <w:rPr>
                 <w:sz w:val="18"/>
               </w:rPr>
+              <w:t>按 1 × 单价计算，金额旁提示结算金额对不上</w:t>
+            </w:r>
+          </w:p>
+        </w:tc>
+      </w:tr>
+      <w:tr>
+        <w:tc>
+          <w:tcPr>
+            <w:tcW w:type="dxa" w:w="3324"/>
+          </w:tcPr>
+          <w:p>
+            <w:r>
+              <w:rPr>
+                <w:sz w:val="18"/>
+              </w:rPr>
+            </w:r>
+            <w:r>
+              <w:rPr>
+                <w:sz w:val="18"/>
+              </w:rPr>
+              <w:t>L7</w:t>
+            </w:r>
+          </w:p>
+        </w:tc>
+        <w:tc>
+          <w:tcPr>
+            <w:tcW w:type="dxa" w:w="3324"/>
+          </w:tcPr>
+          <w:p>
+            <w:r>
+              <w:rPr>
+                <w:sz w:val="18"/>
+              </w:rPr>
+            </w:r>
+            <w:r>
+              <w:rPr>
+                <w:sz w:val="18"/>
+              </w:rPr>
+              <w:t xml:space="preserve">拉活表表头为“统计日期 / 渠道 / 关键字 / 拉活数 / 补贴金额”，日期写成 </w:t>
+            </w:r>
+            <w:r>
+              <w:rPr>
+                <w:rFonts w:ascii="Consolas" w:hAnsi="Consolas"/>
+                <w:sz w:val="18"/>
+              </w:rPr>
+              <w:t>2026年9月14日</w:t>
+            </w:r>
+          </w:p>
+        </w:tc>
+        <w:tc>
+          <w:tcPr>
+            <w:tcW w:type="dxa" w:w="3324"/>
+          </w:tcPr>
+          <w:p>
+            <w:r>
+              <w:rPr>
+                <w:sz w:val="18"/>
+              </w:rPr>
+            </w:r>
+            <w:r>
+              <w:rPr>
+                <w:sz w:val="18"/>
+              </w:rPr>
+              <w:t>正常识别</w:t>
+            </w:r>
+          </w:p>
+        </w:tc>
+      </w:tr>
+      <w:tr>
+        <w:tc>
+          <w:tcPr>
+            <w:tcW w:type="dxa" w:w="3324"/>
+          </w:tcPr>
+          <w:p>
+            <w:r>
+              <w:rPr>
+                <w:sz w:val="18"/>
+              </w:rPr>
+            </w:r>
+            <w:r>
+              <w:rPr>
+                <w:sz w:val="18"/>
+              </w:rPr>
+              <w:t>L8</w:t>
+            </w:r>
+          </w:p>
+        </w:tc>
+        <w:tc>
+          <w:tcPr>
+            <w:tcW w:type="dxa" w:w="3324"/>
+          </w:tcPr>
+          <w:p>
+            <w:r>
+              <w:rPr>
+                <w:sz w:val="18"/>
+              </w:rPr>
+            </w:r>
+            <w:r>
+              <w:rPr>
+                <w:sz w:val="18"/>
+              </w:rPr>
+              <w:t>拉活表保存为 GBK 编码的 .csv</w:t>
+            </w:r>
+          </w:p>
+        </w:tc>
+        <w:tc>
+          <w:tcPr>
+            <w:tcW w:type="dxa" w:w="3324"/>
+          </w:tcPr>
+          <w:p>
+            <w:r>
+              <w:rPr>
+                <w:sz w:val="18"/>
+              </w:rPr>
+            </w:r>
+            <w:r>
+              <w:rPr>
+                <w:sz w:val="18"/>
+              </w:rPr>
+              <w:t>正常识别</w:t>
+            </w:r>
+          </w:p>
+        </w:tc>
+      </w:tr>
+      <w:tr>
+        <w:tc>
+          <w:tcPr>
+            <w:tcW w:type="dxa" w:w="3324"/>
+          </w:tcPr>
+          <w:p>
+            <w:r>
+              <w:rPr>
+                <w:sz w:val="18"/>
+              </w:rPr>
+            </w:r>
+            <w:r>
+              <w:rPr>
+                <w:sz w:val="18"/>
+              </w:rPr>
+              <w:t>L9</w:t>
+            </w:r>
+          </w:p>
+        </w:tc>
+        <w:tc>
+          <w:tcPr>
+            <w:tcW w:type="dxa" w:w="3324"/>
+          </w:tcPr>
+          <w:p>
+            <w:r>
+              <w:rPr>
+                <w:sz w:val="18"/>
+              </w:rPr>
+            </w:r>
+            <w:r>
+              <w:rPr>
+                <w:sz w:val="18"/>
+              </w:rPr>
+              <w:t>团长本人执行的拉活 2 个</w:t>
+            </w:r>
+          </w:p>
+        </w:tc>
+        <w:tc>
+          <w:tcPr>
+            <w:tcW w:type="dxa" w:w="3324"/>
+          </w:tcPr>
+          <w:p>
+            <w:r>
+              <w:rPr>
+                <w:sz w:val="18"/>
+              </w:rPr>
+            </w:r>
+            <w:r>
+              <w:rPr>
+                <w:sz w:val="18"/>
+              </w:rPr>
+              <w:t>团长 ¥3.20</w:t>
+            </w:r>
+          </w:p>
+        </w:tc>
+      </w:tr>
+      <w:tr>
+        <w:tc>
+          <w:tcPr>
+            <w:tcW w:type="dxa" w:w="3324"/>
+          </w:tcPr>
+          <w:p>
+            <w:r>
+              <w:rPr>
+                <w:sz w:val="18"/>
+              </w:rPr>
+            </w:r>
+            <w:r>
+              <w:rPr>
+                <w:sz w:val="18"/>
+              </w:rPr>
+              <w:t>L10</w:t>
+            </w:r>
+          </w:p>
+        </w:tc>
+        <w:tc>
+          <w:tcPr>
+            <w:tcW w:type="dxa" w:w="3324"/>
+          </w:tcPr>
+          <w:p>
+            <w:r>
+              <w:rPr>
+                <w:sz w:val="18"/>
+              </w:rPr>
+            </w:r>
+            <w:r>
+              <w:rPr>
+                <w:sz w:val="18"/>
+              </w:rPr>
+              <w:t>独立达人小陈的拉活 3 个</w:t>
+            </w:r>
+          </w:p>
+        </w:tc>
+        <w:tc>
+          <w:tcPr>
+            <w:tcW w:type="dxa" w:w="3324"/>
+          </w:tcPr>
+          <w:p>
+            <w:r>
+              <w:rPr>
+                <w:sz w:val="18"/>
+              </w:rPr>
+            </w:r>
+            <w:r>
+              <w:rPr>
+                <w:sz w:val="18"/>
+              </w:rPr>
+              <w:t>小陈 ¥3.60</w:t>
+            </w:r>
+          </w:p>
+        </w:tc>
+      </w:tr>
+      <w:tr>
+        <w:tc>
+          <w:tcPr>
+            <w:tcW w:type="dxa" w:w="3324"/>
+          </w:tcPr>
+          <w:p>
+            <w:r>
+              <w:rPr>
+                <w:sz w:val="18"/>
+              </w:rPr>
+            </w:r>
+            <w:r>
+              <w:rPr>
+                <w:sz w:val="18"/>
+              </w:rPr>
+              <w:t>L11</w:t>
+            </w:r>
+          </w:p>
+        </w:tc>
+        <w:tc>
+          <w:tcPr>
+            <w:tcW w:type="dxa" w:w="3324"/>
+          </w:tcPr>
+          <w:p>
+            <w:r>
+              <w:rPr>
+                <w:sz w:val="18"/>
+              </w:rPr>
+            </w:r>
+            <w:r>
+              <w:rPr>
+                <w:sz w:val="18"/>
+              </w:rPr>
+              <w:t>管理员本人执行的拉活（P1-9 之后）</w:t>
+            </w:r>
+          </w:p>
+        </w:tc>
+        <w:tc>
+          <w:tcPr>
+            <w:tcW w:type="dxa" w:w="3324"/>
+          </w:tcPr>
+          <w:p>
+            <w:r>
+              <w:rPr>
+                <w:sz w:val="18"/>
+              </w:rPr>
+            </w:r>
+            <w:r>
+              <w:rPr>
+                <w:sz w:val="18"/>
+              </w:rPr>
+              <w:t>管理员业绩 ¥2.00 / 个，不进入应付合计和待开放款项</w:t>
+            </w:r>
+          </w:p>
+        </w:tc>
+      </w:tr>
+      <w:tr>
+        <w:tc>
+          <w:tcPr>
+            <w:tcW w:type="dxa" w:w="3324"/>
+          </w:tcPr>
+          <w:p>
+            <w:r>
+              <w:rPr>
+                <w:sz w:val="18"/>
+              </w:rPr>
+            </w:r>
+            <w:r>
+              <w:rPr>
+                <w:sz w:val="18"/>
+              </w:rPr>
+              <w:t>L12</w:t>
+            </w:r>
+          </w:p>
+        </w:tc>
+        <w:tc>
+          <w:tcPr>
+            <w:tcW w:type="dxa" w:w="3324"/>
+          </w:tcPr>
+          <w:p>
+            <w:r>
+              <w:rPr>
+                <w:sz w:val="18"/>
+              </w:rPr>
+            </w:r>
+            <w:r>
+              <w:rPr>
+                <w:sz w:val="18"/>
+              </w:rPr>
+              <w:t xml:space="preserve">运营职责管理员请求 </w:t>
+            </w:r>
+            <w:r>
+              <w:rPr>
+                <w:rFonts w:ascii="Consolas" w:hAnsi="Consolas"/>
+                <w:sz w:val="18"/>
+              </w:rPr>
+              <w:t>/workbench</w:t>
+            </w:r>
+          </w:p>
+        </w:tc>
+        <w:tc>
+          <w:tcPr>
+            <w:tcW w:type="dxa" w:w="3324"/>
+          </w:tcPr>
+          <w:p>
+            <w:r>
+              <w:rPr>
+                <w:sz w:val="18"/>
+              </w:rPr>
+            </w:r>
+            <w:r>
+              <w:rPr>
+                <w:sz w:val="18"/>
+              </w:rPr>
+              <w:t>403</w:t>
+            </w:r>
+          </w:p>
+        </w:tc>
+      </w:tr>
+      <w:tr>
+        <w:tc>
+          <w:tcPr>
+            <w:tcW w:type="dxa" w:w="3324"/>
+          </w:tcPr>
+          <w:p>
+            <w:r>
+              <w:rPr>
+                <w:sz w:val="18"/>
+              </w:rPr>
+            </w:r>
+            <w:r>
+              <w:rPr>
+                <w:sz w:val="18"/>
+              </w:rPr>
+              <w:t>L13</w:t>
+            </w:r>
+          </w:p>
+        </w:tc>
+        <w:tc>
+          <w:tcPr>
+            <w:tcW w:type="dxa" w:w="3324"/>
+          </w:tcPr>
+          <w:p>
+            <w:r>
+              <w:rPr>
+                <w:sz w:val="18"/>
+              </w:rPr>
+            </w:r>
+            <w:r>
+              <w:rPr>
+                <w:sz w:val="18"/>
+              </w:rPr>
+              <w:t xml:space="preserve">团长请求 </w:t>
+            </w:r>
+            <w:r>
+              <w:rPr>
+                <w:rFonts w:ascii="Consolas" w:hAnsi="Consolas"/>
+                <w:sz w:val="18"/>
+              </w:rPr>
+              <w:t>/workbench</w:t>
+            </w:r>
+          </w:p>
+        </w:tc>
+        <w:tc>
+          <w:tcPr>
+            <w:tcW w:type="dxa" w:w="3324"/>
+          </w:tcPr>
+          <w:p>
+            <w:r>
+              <w:rPr>
+                <w:sz w:val="18"/>
+              </w:rPr>
+            </w:r>
+            <w:r>
+              <w:rPr>
+                <w:sz w:val="18"/>
+              </w:rPr>
+              <w:t>看不到团队达人的个人金额</w:t>
+            </w:r>
+          </w:p>
+        </w:tc>
+      </w:tr>
+      <w:tr>
+        <w:tc>
+          <w:tcPr>
+            <w:tcW w:type="dxa" w:w="3324"/>
+          </w:tcPr>
+          <w:p>
+            <w:r>
+              <w:rPr>
+                <w:sz w:val="18"/>
+              </w:rPr>
+            </w:r>
+            <w:r>
+              <w:rPr>
+                <w:sz w:val="18"/>
+              </w:rPr>
+              <w:t>L14</w:t>
+            </w:r>
+          </w:p>
+        </w:tc>
+        <w:tc>
+          <w:tcPr>
+            <w:tcW w:type="dxa" w:w="3324"/>
+          </w:tcPr>
+          <w:p>
+            <w:r>
+              <w:rPr>
+                <w:sz w:val="18"/>
+              </w:rPr>
+            </w:r>
+            <w:r>
+              <w:rPr>
+                <w:sz w:val="18"/>
+              </w:rPr>
+              <w:t>报表含“合计”行、1 行日期错误</w:t>
+            </w:r>
+          </w:p>
+        </w:tc>
+        <w:tc>
+          <w:tcPr>
+            <w:tcW w:type="dxa" w:w="3324"/>
+          </w:tcPr>
+          <w:p>
+            <w:r>
+              <w:rPr>
+                <w:sz w:val="18"/>
+              </w:rPr>
+            </w:r>
+            <w:r>
+              <w:rPr>
+                <w:sz w:val="18"/>
+              </w:rPr>
+              <w:t>合计行跳过，错误行单独显示原因，其余正常</w:t>
+            </w:r>
+          </w:p>
+        </w:tc>
+      </w:tr>
+      <w:tr>
+        <w:tc>
+          <w:tcPr>
+            <w:tcW w:type="dxa" w:w="3324"/>
+          </w:tcPr>
+          <w:p>
+            <w:r>
+              <w:rPr>
+                <w:sz w:val="18"/>
+              </w:rPr>
+            </w:r>
+            <w:r>
+              <w:rPr>
+                <w:sz w:val="18"/>
+              </w:rPr>
+              <w:t>L15</w:t>
+            </w:r>
+          </w:p>
+        </w:tc>
+        <w:tc>
+          <w:tcPr>
+            <w:tcW w:type="dxa" w:w="3324"/>
+          </w:tcPr>
+          <w:p>
+            <w:r>
+              <w:rPr>
+                <w:sz w:val="18"/>
+              </w:rPr>
+            </w:r>
+            <w:r>
+              <w:rPr>
+                <w:sz w:val="18"/>
+              </w:rPr>
+              <w:t>首次上传后上传更早日期（旧系统无数据）</w:t>
+            </w:r>
+          </w:p>
+        </w:tc>
+        <w:tc>
+          <w:tcPr>
+            <w:tcW w:type="dxa" w:w="3324"/>
+          </w:tcPr>
+          <w:p>
+            <w:r>
+              <w:rPr>
+                <w:sz w:val="18"/>
+              </w:rPr>
+            </w:r>
+            <w:r>
+              <w:rPr>
+                <w:sz w:val="18"/>
+              </w:rPr>
+              <w:t>正常计算，生效日前移</w:t>
+            </w:r>
+          </w:p>
+        </w:tc>
+      </w:tr>
+      <w:tr>
+        <w:tc>
+          <w:tcPr>
+            <w:tcW w:type="dxa" w:w="3324"/>
+          </w:tcPr>
+          <w:p>
+            <w:r>
+              <w:rPr>
+                <w:sz w:val="18"/>
+              </w:rPr>
+            </w:r>
+            <w:r>
+              <w:rPr>
+                <w:sz w:val="18"/>
+              </w:rPr>
+              <w:t>L16</w:t>
+            </w:r>
+          </w:p>
+        </w:tc>
+        <w:tc>
+          <w:tcPr>
+            <w:tcW w:type="dxa" w:w="3324"/>
+          </w:tcPr>
+          <w:p>
+            <w:r>
+              <w:rPr>
+                <w:sz w:val="18"/>
+              </w:rPr>
+            </w:r>
+            <w:r>
+              <w:rPr>
+                <w:sz w:val="18"/>
+              </w:rPr>
+              <w:t>没有执行人的关键词，补录执行人</w:t>
+            </w:r>
+          </w:p>
+        </w:tc>
+        <w:tc>
+          <w:tcPr>
+            <w:tcW w:type="dxa" w:w="3324"/>
+          </w:tcPr>
+          <w:p>
+            <w:r>
+              <w:rPr>
+                <w:sz w:val="18"/>
+              </w:rPr>
+            </w:r>
+            <w:r>
+              <w:rPr>
+                <w:sz w:val="18"/>
+              </w:rPr>
               <w:t>自动重算，钱找回；关键词不再被锁</w:t>
+            </w:r>
+          </w:p>
+        </w:tc>
+      </w:tr>
+      <w:tr>
+        <w:tc>
+          <w:tcPr>
+            <w:tcW w:type="dxa" w:w="3324"/>
+          </w:tcPr>
+          <w:p>
+            <w:r>
+              <w:rPr>
+                <w:sz w:val="18"/>
+              </w:rPr>
+            </w:r>
+            <w:r>
+              <w:rPr>
+                <w:sz w:val="18"/>
+              </w:rPr>
+              <w:t>L17</w:t>
+            </w:r>
+          </w:p>
+        </w:tc>
+        <w:tc>
+          <w:tcPr>
+            <w:tcW w:type="dxa" w:w="3324"/>
+          </w:tcPr>
+          <w:p>
+            <w:r>
+              <w:rPr>
+                <w:sz w:val="18"/>
+              </w:rPr>
+            </w:r>
+            <w:r>
+              <w:rPr>
+                <w:sz w:val="18"/>
+              </w:rPr>
+              <w:t>未设报价的团队达人做了 10 单拉新</w:t>
+            </w:r>
+          </w:p>
+        </w:tc>
+        <w:tc>
+          <w:tcPr>
+            <w:tcW w:type="dxa" w:w="3324"/>
+          </w:tcPr>
+          <w:p>
+            <w:r>
+              <w:rPr>
+                <w:sz w:val="18"/>
+              </w:rPr>
+            </w:r>
+            <w:r>
+              <w:rPr>
+                <w:sz w:val="18"/>
+              </w:rPr>
+              <w:t>按角色单价兜底：达人 80.00，团长 5.00</w:t>
+            </w:r>
+          </w:p>
+        </w:tc>
+      </w:tr>
+      <w:tr>
+        <w:tc>
+          <w:tcPr>
+            <w:tcW w:type="dxa" w:w="3324"/>
+          </w:tcPr>
+          <w:p>
+            <w:r>
+              <w:rPr>
+                <w:sz w:val="18"/>
+              </w:rPr>
+            </w:r>
+            <w:r>
+              <w:rPr>
+                <w:sz w:val="18"/>
+              </w:rPr>
+              <w:t>L18</w:t>
+            </w:r>
+          </w:p>
+        </w:tc>
+        <w:tc>
+          <w:tcPr>
+            <w:tcW w:type="dxa" w:w="3324"/>
+          </w:tcPr>
+          <w:p>
+            <w:r>
+              <w:rPr>
+                <w:sz w:val="18"/>
+              </w:rPr>
+            </w:r>
+            <w:r>
+              <w:rPr>
+                <w:sz w:val="18"/>
+              </w:rPr>
+              <w:t>四个角色逐一登录</w:t>
+            </w:r>
+          </w:p>
+        </w:tc>
+        <w:tc>
+          <w:tcPr>
+            <w:tcW w:type="dxa" w:w="3324"/>
+          </w:tcPr>
+          <w:p>
+            <w:r>
+              <w:rPr>
+                <w:sz w:val="18"/>
+              </w:rPr>
+            </w:r>
+            <w:r>
+              <w:rPr>
+                <w:sz w:val="18"/>
+              </w:rPr>
+              <w:t>导航中没有占位页和旧资金页；旧地址能打开并看到合并提示</w:t>
             </w:r>
           </w:p>
         </w:tc>

</xml_diff>